<commit_message>
docs: el sistema que se reemplaza es MetaClass - confirmado por el autor
Ahora si se nombra, porque lo confirmo el autor. No se nombro antes a proposito:
la cadena "MetaClass" NO aparece en script.sql, asi que ponerla habria sido
sustituir una atribucion inferida por otra.

El cambio ademas cierra un circulo que quedaba suelto en el documento: el
dataset de entrenamiento -1.113 cariogramas, 48.000 recortes- sale de la base
SCAMC de MetaClass. Es decir, el sistema aprende del archivo real del sistema al
que sustituye. Eso ahora se dice explicitamente.

Queda claramente separado lo que antes se mezclaba:
  - lo que se REEMPLAZA: MetaClass, del que se conserva el esquema y las imagenes
  - con que se COMPARA: Ikaros 7, referencia externa del estado del arte

Corregido en los 5 documentos. Verificado: MetaClass presente, Ikaros ausente
como sistema del laboratorio.

Co-Authored-By: Claude Opus 5 <noreply@anthropic.com>
</commit_message>
<xml_diff>
--- a/docs/INFORME_ESTADO_SISTEMA.docx
+++ b/docs/INFORME_ESTADO_SISTEMA.docx
@@ -2825,7 +2825,7 @@
         <w:rPr>
           <w:i/>
         </w:rPr>
-        <w:t>es el sistema que usa este laboratorio** — el laboratorio tiene un sistema</w:t>
+        <w:t>es el sistema que usa este laboratorio** — el laboratorio trabaja con</w:t>
       </w:r>
     </w:p>
     <w:p>
@@ -2835,9 +2835,16 @@
       </w:pPr>
       <w:r>
         <w:rPr>
+          <w:b/>
           <w:i/>
         </w:rPr>
-        <w:t xml:space="preserve">legado propio (base SQL Server </w:t>
+        <w:t>MetaClass</w:t>
+      </w:r>
+      <w:r>
+        <w:rPr>
+          <w:i/>
+        </w:rPr>
+        <w:t xml:space="preserve"> (base SQL Server </w:t>
       </w:r>
       <w:r>
         <w:rPr>
@@ -2851,7 +2858,7 @@
         <w:rPr>
           <w:i/>
         </w:rPr>
-        <w:t>, 48 tablas) que este proyecto</w:t>
+        <w:t>, 48 tablas), que es lo que este</w:t>
       </w:r>
     </w:p>
     <w:p>
@@ -2863,7 +2870,7 @@
         <w:rPr>
           <w:i/>
         </w:rPr>
-        <w:t>reemplaza. Ikaros se usa aquí como **referencia externa del estado del</w:t>
+        <w:t>proyecto reemplaza. Ikaros se usa aquí como **referencia externa del estado</w:t>
       </w:r>
     </w:p>
     <w:p>
@@ -2875,7 +2882,7 @@
         <w:rPr>
           <w:i/>
         </w:rPr>
-        <w:t>arte**, no como el sistema desplazado.</w:t>
+        <w:t>del arte**, no como el sistema desplazado.</w:t>
       </w:r>
     </w:p>
     <w:p>
@@ -3369,10 +3376,10 @@
         <w:rPr>
           <w:b/>
         </w:rPr>
-        <w:t>Lo que este proyecto reemplaza es un sistema legado propio</w:t>
-      </w:r>
-      <w:r>
-        <w:t>, del que se conserva hasta el esquema de base de datos y del que salieron las 1.113 imágenes usadas para entrenar.</w:t>
+        <w:t>Lo que este proyecto reemplaza es MetaClass</w:t>
+      </w:r>
+      <w:r>
+        <w:t>, del que se conserva hasta el esquema de base de datos y del que salieron las 1.113 imágenes usadas para entrenar el clasificador.</w:t>
       </w:r>
     </w:p>
     <w:p>

</xml_diff>